<commit_message>
Revise PLC-001/PLC-002: exact-region default (validates), geography-only exception (explicit approval + fixed seed)
</commit_message>
<xml_diff>
--- a/docs/acrme_calculation_logic_reference.docx
+++ b/docs/acrme_calculation_logic_reference.docx
@@ -589,6 +589,22 @@
               </w:rPr>
               <w:t xml:space="preserve">geography</w:t>
             </w:r>
+            <w:r>
+              <w:t xml:space="preserve"> </w:t>
+            </w:r>
+            <w:r>
+              <w:t xml:space="preserve">(</w:t>
+            </w:r>
+            <w:r>
+              <w:rPr>
+                <w:bCs/>
+                <w:b/>
+              </w:rPr>
+              <w:t xml:space="preserve">exception path</w:t>
+            </w:r>
+            <w:r>
+              <w:t xml:space="preserve">; explicit approval + customer acknowledgement required)</w:t>
+            </w:r>
           </w:p>
         </w:tc>
         <w:tc>
@@ -646,7 +662,7 @@
               <w:jc w:val="left"/>
             </w:pPr>
             <w:r>
-              <w:t xml:space="preserve">Prod region validation — customer picks a</w:t>
+              <w:t xml:space="preserve">Prod region validation — customer supplies the</w:t>
             </w:r>
             <w:r>
               <w:t xml:space="preserve"> </w:t>
@@ -656,7 +672,23 @@
                 <w:bCs/>
                 <w:b/>
               </w:rPr>
-              <w:t xml:space="preserve">specific region</w:t>
+              <w:t xml:space="preserve">exact region</w:t>
+            </w:r>
+            <w:r>
+              <w:t xml:space="preserve"> </w:t>
+            </w:r>
+            <w:r>
+              <w:t xml:space="preserve">(</w:t>
+            </w:r>
+            <w:r>
+              <w:rPr>
+                <w:bCs/>
+                <w:b/>
+              </w:rPr>
+              <w:t xml:space="preserve">default input</w:t>
+            </w:r>
+            <w:r>
+              <w:t xml:space="preserve">; ACRME validates, does not derive)</w:t>
             </w:r>
           </w:p>
         </w:tc>
@@ -2180,19 +2212,46 @@
           <w:bCs/>
           <w:b/>
         </w:rPr>
-        <w:t xml:space="preserve">Note (PLC-001/PLC-002):</w:t>
-      </w:r>
-      <w:r>
-        <w:t xml:space="preserve"> </w:t>
-      </w:r>
-      <w:r>
-        <w:t xml:space="preserve">Exact-region input (Scenario 2) is the preferred default. Geography-based</w:t>
-      </w:r>
-      <w:r>
-        <w:t xml:space="preserve"> </w:t>
-      </w:r>
-      <w:r>
-        <w:t xml:space="preserve">selection is an exception path requiring approval and customer acknowledgement.</w:t>
+        <w:t xml:space="preserve">Status: Exception path — not the default (PLC-002).</w:t>
+      </w:r>
+      <w:r>
+        <w:t xml:space="preserve"> </w:t>
+      </w:r>
+      <w:r>
+        <w:t xml:space="preserve">Requires explicit exception approval and</w:t>
+      </w:r>
+      <w:r>
+        <w:t xml:space="preserve"> </w:t>
+      </w:r>
+      <w:r>
+        <w:t xml:space="preserve">customer acknowledgement that the</w:t>
+      </w:r>
+      <w:r>
+        <w:t xml:space="preserve"> </w:t>
+      </w:r>
+      <w:r>
+        <w:rPr>
+          <w:bCs/>
+          <w:b/>
+        </w:rPr>
+        <w:t xml:space="preserve">derived production region becomes fixed until an approved migration</w:t>
+      </w:r>
+      <w:r>
+        <w:rPr>
+          <w:bCs/>
+          <w:b/>
+        </w:rPr>
+        <w:t xml:space="preserve"> </w:t>
+      </w:r>
+      <w:r>
+        <w:rPr>
+          <w:bCs/>
+          <w:b/>
+        </w:rPr>
+        <w:t xml:space="preserve">changes the seed</w:t>
+      </w:r>
+      <w:r>
+        <w:t xml:space="preserve">. Cannot be invoked without a recorded exception reference.</w:t>
       </w:r>
       <w:r>
         <w:t xml:space="preserve"> </w:t>
@@ -2529,7 +2588,55 @@
         <w:t xml:space="preserve"> </w:t>
       </w:r>
       <w:r>
-        <w:t xml:space="preserve">customer names an exact Azure region — the preferred/default input mode (PLC-001).</w:t>
+        <w:t xml:space="preserve">customer names an exact Azure region — the</w:t>
+      </w:r>
+      <w:r>
+        <w:t xml:space="preserve"> </w:t>
+      </w:r>
+      <w:r>
+        <w:rPr>
+          <w:bCs/>
+          <w:b/>
+        </w:rPr>
+        <w:t xml:space="preserve">default</w:t>
+      </w:r>
+      <w:r>
+        <w:t xml:space="preserve"> </w:t>
+      </w:r>
+      <w:r>
+        <w:t xml:space="preserve">input mode (PLC-001). ACRME</w:t>
+      </w:r>
+      <w:r>
+        <w:t xml:space="preserve"> </w:t>
+      </w:r>
+      <w:r>
+        <w:rPr>
+          <w:bCs/>
+          <w:b/>
+        </w:rPr>
+        <w:t xml:space="preserve">validates</w:t>
+      </w:r>
+      <w:r>
+        <w:t xml:space="preserve"> </w:t>
+      </w:r>
+      <w:r>
+        <w:t xml:space="preserve">the supplied region against HC-1..HC-10 and placement-policy rules; it does</w:t>
+      </w:r>
+      <w:r>
+        <w:t xml:space="preserve"> </w:t>
+      </w:r>
+      <w:r>
+        <w:rPr>
+          <w:bCs/>
+          <w:b/>
+        </w:rPr>
+        <w:t xml:space="preserve">not</w:t>
+      </w:r>
+      <w:r>
+        <w:t xml:space="preserve"> </w:t>
+      </w:r>
+      <w:r>
+        <w:t xml:space="preserve">derive a region from geography.</w:t>
       </w:r>
       <w:r>
         <w:t xml:space="preserve"> </w:t>

</xml_diff>